<commit_message>
Ajout API REST, orchestrateur et modeles de base de donnees
</commit_message>
<xml_diff>
--- a/conception/Etape de la conception.docx
+++ b/conception/Etape de la conception.docx
@@ -131,29 +131,16 @@
           <w:szCs w:val="40"/>
         </w:rPr>
       </w:pPr>
-    </w:p>
-    <w:p>
-      <w:pPr>
-        <w:rPr>
-          <w:b/>
-          <w:bCs/>
-          <w:sz w:val="40"/>
-          <w:szCs w:val="40"/>
-        </w:rPr>
-      </w:pPr>
       <w:r>
         <w:rPr>
-          <w:b/>
-          <w:bCs/>
-          <w:noProof/>
           <w:sz w:val="40"/>
           <w:szCs w:val="40"/>
         </w:rPr>
         <w:drawing>
-          <wp:inline distT="0" distB="0" distL="0" distR="0" wp14:anchorId="269A52F6" wp14:editId="4FF2315B">
-            <wp:extent cx="5760720" cy="3288030"/>
-            <wp:effectExtent l="0" t="0" r="0" b="7620"/>
-            <wp:docPr id="205483582" name="Image 1"/>
+          <wp:inline distT="0" distB="0" distL="0" distR="0" wp14:anchorId="57BBFECB" wp14:editId="5F12AB5C">
+            <wp:extent cx="5760720" cy="3033395"/>
+            <wp:effectExtent l="0" t="0" r="0" b="0"/>
+            <wp:docPr id="1687457317" name="Image 1"/>
             <wp:cNvGraphicFramePr>
               <a:graphicFrameLocks xmlns:a="http://schemas.openxmlformats.org/drawingml/2006/main" noChangeAspect="1"/>
             </wp:cNvGraphicFramePr>
@@ -161,7 +148,7 @@
               <a:graphicData uri="http://schemas.openxmlformats.org/drawingml/2006/picture">
                 <pic:pic xmlns:pic="http://schemas.openxmlformats.org/drawingml/2006/picture">
                   <pic:nvPicPr>
-                    <pic:cNvPr id="205483582" name=""/>
+                    <pic:cNvPr id="1687457317" name=""/>
                     <pic:cNvPicPr/>
                   </pic:nvPicPr>
                   <pic:blipFill>
@@ -173,7 +160,7 @@
                   <pic:spPr>
                     <a:xfrm>
                       <a:off x="0" y="0"/>
-                      <a:ext cx="5760720" cy="3288030"/>
+                      <a:ext cx="5760720" cy="3033395"/>
                     </a:xfrm>
                     <a:prstGeom prst="rect">
                       <a:avLst/>
@@ -191,654 +178,23 @@
         <w:rPr>
           <w:b/>
           <w:bCs/>
-          <w:sz w:val="20"/>
-          <w:szCs w:val="20"/>
+          <w:sz w:val="40"/>
+          <w:szCs w:val="40"/>
         </w:rPr>
       </w:pPr>
       <w:r>
         <w:rPr>
           <w:b/>
           <w:bCs/>
-          <w:sz w:val="20"/>
-          <w:szCs w:val="20"/>
-        </w:rPr>
-        <w:t>A. Cycle d'achat classique</w:t>
-      </w:r>
-    </w:p>
-    <w:p>
-      <w:pPr>
-        <w:rPr>
-          <w:b/>
-          <w:bCs/>
-          <w:sz w:val="20"/>
-          <w:szCs w:val="20"/>
-        </w:rPr>
-      </w:pPr>
-      <w:r>
-        <w:rPr>
-          <w:b/>
-          <w:bCs/>
-          <w:sz w:val="20"/>
-          <w:szCs w:val="20"/>
-        </w:rPr>
-        <w:lastRenderedPageBreak/>
-        <w:t>PASSER — Un fournisseur reçoit plusieurs commandes (</w:t>
-      </w:r>
-      <w:proofErr w:type="gramStart"/>
-      <w:r>
-        <w:rPr>
-          <w:b/>
-          <w:bCs/>
-          <w:sz w:val="20"/>
-          <w:szCs w:val="20"/>
-        </w:rPr>
-        <w:t>1,N</w:t>
-      </w:r>
-      <w:proofErr w:type="gramEnd"/>
-      <w:r>
-        <w:rPr>
-          <w:b/>
-          <w:bCs/>
-          <w:sz w:val="20"/>
-          <w:szCs w:val="20"/>
-        </w:rPr>
-        <w:t>) ; une commande va à un seul fournisseur (</w:t>
-      </w:r>
-      <w:proofErr w:type="gramStart"/>
-      <w:r>
-        <w:rPr>
-          <w:b/>
-          <w:bCs/>
-          <w:sz w:val="20"/>
-          <w:szCs w:val="20"/>
-        </w:rPr>
-        <w:t>0,N</w:t>
-      </w:r>
-      <w:proofErr w:type="gramEnd"/>
-      <w:r>
-        <w:rPr>
-          <w:b/>
-          <w:bCs/>
-          <w:sz w:val="20"/>
-          <w:szCs w:val="20"/>
-        </w:rPr>
-        <w:t>).</w:t>
-      </w:r>
-    </w:p>
-    <w:p>
-      <w:pPr>
-        <w:rPr>
-          <w:b/>
-          <w:bCs/>
-          <w:sz w:val="20"/>
-          <w:szCs w:val="20"/>
-        </w:rPr>
-      </w:pPr>
-      <w:r>
-        <w:rPr>
-          <w:b/>
-          <w:bCs/>
-          <w:sz w:val="20"/>
-          <w:szCs w:val="20"/>
-        </w:rPr>
-        <w:t>RATTACHER — Chaque commande appartient à une entité interne précise (</w:t>
-      </w:r>
-      <w:proofErr w:type="gramStart"/>
-      <w:r>
-        <w:rPr>
-          <w:b/>
-          <w:bCs/>
-          <w:sz w:val="20"/>
-          <w:szCs w:val="20"/>
-        </w:rPr>
-        <w:t>1,N</w:t>
-      </w:r>
-      <w:proofErr w:type="gramEnd"/>
-      <w:r>
-        <w:rPr>
-          <w:b/>
-          <w:bCs/>
-          <w:sz w:val="20"/>
-          <w:szCs w:val="20"/>
-        </w:rPr>
-        <w:t xml:space="preserve"> de chaque côté) : par exemple, "la filiale Casablanca a passé cette commande".</w:t>
-      </w:r>
-    </w:p>
-    <w:p>
-      <w:pPr>
-        <w:rPr>
-          <w:b/>
-          <w:bCs/>
-          <w:sz w:val="20"/>
-          <w:szCs w:val="20"/>
-        </w:rPr>
-      </w:pPr>
-      <w:r>
-        <w:rPr>
-          <w:b/>
-          <w:bCs/>
-          <w:sz w:val="20"/>
-          <w:szCs w:val="20"/>
-        </w:rPr>
-        <w:t>RÉCEPTIONNER — Une commande peut être livrée en plusieurs fois (</w:t>
-      </w:r>
-      <w:proofErr w:type="gramStart"/>
-      <w:r>
-        <w:rPr>
-          <w:b/>
-          <w:bCs/>
-          <w:sz w:val="20"/>
-          <w:szCs w:val="20"/>
-        </w:rPr>
-        <w:t>1,N</w:t>
-      </w:r>
-      <w:proofErr w:type="gramEnd"/>
-      <w:r>
-        <w:rPr>
-          <w:b/>
-          <w:bCs/>
-          <w:sz w:val="20"/>
-          <w:szCs w:val="20"/>
-        </w:rPr>
-        <w:t xml:space="preserve"> → </w:t>
-      </w:r>
-      <w:proofErr w:type="gramStart"/>
-      <w:r>
-        <w:rPr>
-          <w:b/>
-          <w:bCs/>
-          <w:sz w:val="20"/>
-          <w:szCs w:val="20"/>
-        </w:rPr>
-        <w:t>0,N</w:t>
-      </w:r>
-      <w:proofErr w:type="gramEnd"/>
-      <w:r>
-        <w:rPr>
-          <w:b/>
-          <w:bCs/>
-          <w:sz w:val="20"/>
-          <w:szCs w:val="20"/>
-        </w:rPr>
-        <w:t>) : livraison partielle possible.</w:t>
-      </w:r>
-    </w:p>
-    <w:p>
-      <w:pPr>
-        <w:rPr>
-          <w:b/>
-          <w:bCs/>
-          <w:sz w:val="20"/>
-          <w:szCs w:val="20"/>
-        </w:rPr>
-      </w:pPr>
-      <w:r>
-        <w:rPr>
-          <w:b/>
-          <w:bCs/>
-          <w:sz w:val="20"/>
-          <w:szCs w:val="20"/>
-        </w:rPr>
-        <w:t>B. Facturation</w:t>
-      </w:r>
-    </w:p>
-    <w:p>
-      <w:pPr>
-        <w:rPr>
-          <w:b/>
-          <w:bCs/>
-          <w:sz w:val="20"/>
-          <w:szCs w:val="20"/>
-        </w:rPr>
-      </w:pPr>
-      <w:r>
-        <w:rPr>
-          <w:b/>
-          <w:bCs/>
-          <w:sz w:val="20"/>
-          <w:szCs w:val="20"/>
-        </w:rPr>
-        <w:t xml:space="preserve">ÉMETTRE — Un fournisseur envoie plusieurs factures (1,1 → </w:t>
-      </w:r>
-      <w:proofErr w:type="gramStart"/>
-      <w:r>
-        <w:rPr>
-          <w:b/>
-          <w:bCs/>
-          <w:sz w:val="20"/>
-          <w:szCs w:val="20"/>
-        </w:rPr>
-        <w:t>1,N</w:t>
-      </w:r>
-      <w:proofErr w:type="gramEnd"/>
-      <w:r>
-        <w:rPr>
-          <w:b/>
-          <w:bCs/>
-          <w:sz w:val="20"/>
-          <w:szCs w:val="20"/>
-        </w:rPr>
-        <w:t>), mais chaque facture vient d'un seul fournisseur — pas d'ambiguïté possible.</w:t>
-      </w:r>
-    </w:p>
-    <w:p>
-      <w:pPr>
-        <w:rPr>
-          <w:b/>
-          <w:bCs/>
-          <w:sz w:val="20"/>
-          <w:szCs w:val="20"/>
-        </w:rPr>
-      </w:pPr>
-      <w:r>
-        <w:rPr>
-          <w:b/>
-          <w:bCs/>
-          <w:sz w:val="20"/>
-          <w:szCs w:val="20"/>
-        </w:rPr>
-        <w:t>LIER — On vérifie qu'une facture correspond bien à une réception (</w:t>
-      </w:r>
-      <w:proofErr w:type="gramStart"/>
-      <w:r>
-        <w:rPr>
-          <w:b/>
-          <w:bCs/>
-          <w:sz w:val="20"/>
-          <w:szCs w:val="20"/>
-        </w:rPr>
-        <w:t>0,N</w:t>
-      </w:r>
-      <w:proofErr w:type="gramEnd"/>
-      <w:r>
-        <w:rPr>
-          <w:b/>
-          <w:bCs/>
-          <w:sz w:val="20"/>
-          <w:szCs w:val="20"/>
-        </w:rPr>
-        <w:t xml:space="preserve"> → </w:t>
-      </w:r>
-      <w:proofErr w:type="gramStart"/>
-      <w:r>
-        <w:rPr>
-          <w:b/>
-          <w:bCs/>
-          <w:sz w:val="20"/>
-          <w:szCs w:val="20"/>
-        </w:rPr>
-        <w:t>0,N</w:t>
-      </w:r>
-      <w:proofErr w:type="gramEnd"/>
-      <w:r>
-        <w:rPr>
-          <w:b/>
-          <w:bCs/>
-          <w:sz w:val="20"/>
-          <w:szCs w:val="20"/>
-        </w:rPr>
-        <w:t>) : c'est le contrôle "est-ce qu'on a vraiment reçu ce qu'on nous facture ?"</w:t>
-      </w:r>
-    </w:p>
-    <w:p>
-      <w:pPr>
-        <w:rPr>
-          <w:b/>
-          <w:bCs/>
-          <w:sz w:val="20"/>
-          <w:szCs w:val="20"/>
-        </w:rPr>
-      </w:pPr>
-      <w:r>
-        <w:rPr>
-          <w:b/>
-          <w:bCs/>
-          <w:sz w:val="20"/>
-          <w:szCs w:val="20"/>
-        </w:rPr>
-        <w:t>C. Automatisation</w:t>
-      </w:r>
-    </w:p>
-    <w:p>
-      <w:pPr>
-        <w:rPr>
-          <w:b/>
-          <w:bCs/>
-          <w:sz w:val="20"/>
-          <w:szCs w:val="20"/>
-        </w:rPr>
-      </w:pPr>
-      <w:r>
-        <w:rPr>
-          <w:b/>
-          <w:bCs/>
-          <w:sz w:val="20"/>
-          <w:szCs w:val="20"/>
-        </w:rPr>
-        <w:t>EXTRAIRE — Chaque facture est scannée et lue automatiquement une seule fois (1,1 → 1,1) : relation stricte, un pour un, comme une photocopie numérique associée à l'original.</w:t>
-      </w:r>
-    </w:p>
-    <w:p>
-      <w:pPr>
-        <w:rPr>
-          <w:b/>
-          <w:bCs/>
-          <w:sz w:val="20"/>
-          <w:szCs w:val="20"/>
-        </w:rPr>
-      </w:pPr>
-      <w:r>
-        <w:rPr>
-          <w:b/>
-          <w:bCs/>
-          <w:sz w:val="20"/>
-          <w:szCs w:val="20"/>
-        </w:rPr>
-        <w:t>D. Traçabilité (3 relations vers LOGS)</w:t>
-      </w:r>
-    </w:p>
-    <w:p>
-      <w:pPr>
-        <w:rPr>
-          <w:b/>
-          <w:bCs/>
-          <w:sz w:val="20"/>
-          <w:szCs w:val="20"/>
-        </w:rPr>
-      </w:pPr>
-      <w:r>
-        <w:rPr>
-          <w:b/>
-          <w:bCs/>
-          <w:sz w:val="20"/>
-          <w:szCs w:val="20"/>
-        </w:rPr>
-        <w:t>CONCERNER_FACTURE, CONCERNER_COMMANDE, CONCERNER_RECEPTION — Chacune de ces 3 relations (</w:t>
-      </w:r>
-      <w:proofErr w:type="gramStart"/>
-      <w:r>
-        <w:rPr>
-          <w:b/>
-          <w:bCs/>
-          <w:sz w:val="20"/>
-          <w:szCs w:val="20"/>
-        </w:rPr>
-        <w:t>0,N</w:t>
-      </w:r>
-      <w:proofErr w:type="gramEnd"/>
-      <w:r>
-        <w:rPr>
-          <w:b/>
-          <w:bCs/>
-          <w:sz w:val="20"/>
-          <w:szCs w:val="20"/>
-        </w:rPr>
-        <w:t xml:space="preserve"> → </w:t>
-      </w:r>
-      <w:proofErr w:type="gramStart"/>
-      <w:r>
-        <w:rPr>
-          <w:b/>
-          <w:bCs/>
-          <w:sz w:val="20"/>
-          <w:szCs w:val="20"/>
-        </w:rPr>
-        <w:t>0,N</w:t>
-      </w:r>
-      <w:proofErr w:type="gramEnd"/>
-      <w:r>
-        <w:rPr>
-          <w:b/>
-          <w:bCs/>
-          <w:sz w:val="20"/>
-          <w:szCs w:val="20"/>
-        </w:rPr>
-        <w:t xml:space="preserve">) permet au système de noter : </w:t>
-      </w:r>
-      <w:r>
-        <w:rPr>
-          <w:b/>
-          <w:bCs/>
-          <w:i/>
-          <w:iCs/>
-          <w:sz w:val="20"/>
-          <w:szCs w:val="20"/>
-        </w:rPr>
-        <w:t>"telle action a été faite sur telle facture / commande / réception, par tel utilisateur, à telle date"</w:t>
-      </w:r>
-      <w:r>
-        <w:rPr>
-          <w:b/>
-          <w:bCs/>
-          <w:sz w:val="20"/>
-          <w:szCs w:val="20"/>
-        </w:rPr>
-        <w:t>.</w:t>
-      </w:r>
-    </w:p>
-    <w:p>
-      <w:pPr>
-        <w:rPr>
-          <w:b/>
-          <w:bCs/>
-          <w:sz w:val="20"/>
-          <w:szCs w:val="20"/>
-        </w:rPr>
-      </w:pPr>
-      <w:r>
-        <w:rPr>
-          <w:b/>
-          <w:bCs/>
-          <w:sz w:val="20"/>
-          <w:szCs w:val="20"/>
-        </w:rPr>
-        <w:t>3. Le sens de lecture (très important)</w:t>
-      </w:r>
-    </w:p>
-    <w:p>
-      <w:pPr>
-        <w:rPr>
-          <w:b/>
-          <w:bCs/>
-          <w:sz w:val="20"/>
-          <w:szCs w:val="20"/>
-        </w:rPr>
-      </w:pPr>
-      <w:r>
-        <w:rPr>
-          <w:b/>
-          <w:bCs/>
-          <w:sz w:val="20"/>
-          <w:szCs w:val="20"/>
-        </w:rPr>
-        <w:t xml:space="preserve">Un couple de chiffres comme </w:t>
-      </w:r>
-      <w:proofErr w:type="gramStart"/>
-      <w:r>
-        <w:rPr>
-          <w:b/>
-          <w:bCs/>
-          <w:sz w:val="20"/>
-          <w:szCs w:val="20"/>
-        </w:rPr>
-        <w:t>1,N</w:t>
-      </w:r>
-      <w:proofErr w:type="gramEnd"/>
-      <w:r>
-        <w:rPr>
-          <w:b/>
-          <w:bCs/>
-          <w:sz w:val="20"/>
-          <w:szCs w:val="20"/>
-        </w:rPr>
-        <w:t xml:space="preserve"> se lit du côté opposé de l'entité :</w:t>
-      </w:r>
-    </w:p>
-    <w:p>
-      <w:pPr>
-        <w:rPr>
-          <w:b/>
-          <w:bCs/>
-          <w:sz w:val="20"/>
-          <w:szCs w:val="20"/>
-        </w:rPr>
-      </w:pPr>
-      <w:r>
-        <w:rPr>
-          <w:b/>
-          <w:bCs/>
-          <w:sz w:val="20"/>
-          <w:szCs w:val="20"/>
-        </w:rPr>
-        <w:t>FOURNISSEURS (1,1) ── ÉMETTRE ── (</w:t>
-      </w:r>
-      <w:proofErr w:type="gramStart"/>
-      <w:r>
-        <w:rPr>
-          <w:b/>
-          <w:bCs/>
-          <w:sz w:val="20"/>
-          <w:szCs w:val="20"/>
-        </w:rPr>
-        <w:t>1,N</w:t>
-      </w:r>
-      <w:proofErr w:type="gramEnd"/>
-      <w:r>
-        <w:rPr>
-          <w:b/>
-          <w:bCs/>
-          <w:sz w:val="20"/>
-          <w:szCs w:val="20"/>
-        </w:rPr>
-        <w:t>) FACTURES</w:t>
-      </w:r>
-    </w:p>
-    <w:p>
-      <w:pPr>
-        <w:rPr>
-          <w:b/>
-          <w:bCs/>
-          <w:i/>
-          <w:iCs/>
-          <w:sz w:val="20"/>
-          <w:szCs w:val="20"/>
-        </w:rPr>
-      </w:pPr>
-      <w:r>
-        <w:rPr>
-          <w:b/>
-          <w:bCs/>
-          <w:sz w:val="20"/>
-          <w:szCs w:val="20"/>
-        </w:rPr>
-        <w:t xml:space="preserve">Se lit : </w:t>
-      </w:r>
-      <w:r>
-        <w:rPr>
-          <w:b/>
-          <w:bCs/>
-          <w:i/>
-          <w:iCs/>
-          <w:sz w:val="20"/>
-          <w:szCs w:val="20"/>
-        </w:rPr>
-        <w:t xml:space="preserve">"Une </w:t>
-      </w:r>
-      <w:proofErr w:type="gramStart"/>
-      <w:r>
-        <w:rPr>
-          <w:b/>
-          <w:bCs/>
-          <w:i/>
-          <w:iCs/>
-          <w:sz w:val="20"/>
-          <w:szCs w:val="20"/>
-        </w:rPr>
-        <w:t>facture  est</w:t>
-      </w:r>
-      <w:proofErr w:type="gramEnd"/>
-      <w:r>
-        <w:rPr>
-          <w:b/>
-          <w:bCs/>
-          <w:i/>
-          <w:iCs/>
-          <w:sz w:val="20"/>
-          <w:szCs w:val="20"/>
-        </w:rPr>
-        <w:t xml:space="preserve"> émise par exactement 1 fournisseur (le 1,1 est juste à côté de FOURNISSEURS). Un fournisseur peut émettre 1 ou plusieurs factures (le </w:t>
-      </w:r>
-      <w:proofErr w:type="gramStart"/>
-      <w:r>
-        <w:rPr>
-          <w:b/>
-          <w:bCs/>
-          <w:i/>
-          <w:iCs/>
-          <w:sz w:val="20"/>
-          <w:szCs w:val="20"/>
-        </w:rPr>
-        <w:t>1,N</w:t>
-      </w:r>
-      <w:proofErr w:type="gramEnd"/>
-      <w:r>
-        <w:rPr>
-          <w:b/>
-          <w:bCs/>
-          <w:i/>
-          <w:iCs/>
-          <w:sz w:val="20"/>
-          <w:szCs w:val="20"/>
-        </w:rPr>
-        <w:t xml:space="preserve"> est juste à côté de FACTURES)."</w:t>
-      </w:r>
-    </w:p>
-    <w:p>
-      <w:pPr>
-        <w:rPr>
-          <w:b/>
-          <w:bCs/>
-          <w:i/>
-          <w:iCs/>
-          <w:sz w:val="20"/>
-          <w:szCs w:val="20"/>
-        </w:rPr>
-      </w:pPr>
-      <w:r>
-        <w:rPr>
-          <w:b/>
-          <w:bCs/>
-          <w:i/>
-          <w:iCs/>
-          <w:sz w:val="20"/>
-          <w:szCs w:val="20"/>
-        </w:rPr>
-        <w:t xml:space="preserve">         Diagramme de cas d’utilisation :</w:t>
-      </w:r>
-    </w:p>
-    <w:p>
-      <w:pPr>
-        <w:rPr>
-          <w:b/>
-          <w:bCs/>
-          <w:sz w:val="20"/>
-          <w:szCs w:val="20"/>
-        </w:rPr>
-      </w:pPr>
-      <w:r>
-        <w:rPr>
-          <w:b/>
-          <w:bCs/>
-          <w:noProof/>
-          <w:sz w:val="20"/>
-          <w:szCs w:val="20"/>
+          <w:sz w:val="40"/>
+          <w:szCs w:val="40"/>
         </w:rPr>
         <w:lastRenderedPageBreak/>
         <w:drawing>
-          <wp:inline distT="0" distB="0" distL="0" distR="0" wp14:anchorId="0AB32B7F" wp14:editId="78A80282">
-            <wp:extent cx="5760720" cy="6410325"/>
-            <wp:effectExtent l="0" t="0" r="0" b="9525"/>
-            <wp:docPr id="274073817" name="Image 1"/>
+          <wp:inline distT="0" distB="0" distL="0" distR="0" wp14:anchorId="13BC6789" wp14:editId="749160A3">
+            <wp:extent cx="5760720" cy="4066540"/>
+            <wp:effectExtent l="0" t="0" r="0" b="0"/>
+            <wp:docPr id="946738990" name="Image 1"/>
             <wp:cNvGraphicFramePr>
               <a:graphicFrameLocks xmlns:a="http://schemas.openxmlformats.org/drawingml/2006/main" noChangeAspect="1"/>
             </wp:cNvGraphicFramePr>
@@ -846,7 +202,7 @@
               <a:graphicData uri="http://schemas.openxmlformats.org/drawingml/2006/picture">
                 <pic:pic xmlns:pic="http://schemas.openxmlformats.org/drawingml/2006/picture">
                   <pic:nvPicPr>
-                    <pic:cNvPr id="274073817" name=""/>
+                    <pic:cNvPr id="946738990" name=""/>
                     <pic:cNvPicPr/>
                   </pic:nvPicPr>
                   <pic:blipFill>
@@ -858,7 +214,7 @@
                   <pic:spPr>
                     <a:xfrm>
                       <a:off x="0" y="0"/>
-                      <a:ext cx="5760720" cy="6410325"/>
+                      <a:ext cx="5760720" cy="4066540"/>
                     </a:xfrm>
                     <a:prstGeom prst="rect">
                       <a:avLst/>
@@ -890,20 +246,28 @@
           <w:szCs w:val="20"/>
         </w:rPr>
       </w:pPr>
+    </w:p>
+    <w:p>
+      <w:pPr>
+        <w:rPr>
+          <w:b/>
+          <w:bCs/>
+          <w:sz w:val="20"/>
+          <w:szCs w:val="20"/>
+        </w:rPr>
+      </w:pPr>
       <w:r>
         <w:rPr>
           <w:b/>
           <w:bCs/>
-          <w:noProof/>
           <w:sz w:val="20"/>
           <w:szCs w:val="20"/>
         </w:rPr>
-        <w:lastRenderedPageBreak/>
         <w:drawing>
-          <wp:inline distT="0" distB="0" distL="0" distR="0" wp14:anchorId="38E51F07" wp14:editId="624FBE6D">
-            <wp:extent cx="5760720" cy="4942840"/>
-            <wp:effectExtent l="0" t="0" r="0" b="0"/>
-            <wp:docPr id="796462219" name="Image 1"/>
+          <wp:inline distT="0" distB="0" distL="0" distR="0" wp14:anchorId="59FA5756" wp14:editId="350BC4A9">
+            <wp:extent cx="5760720" cy="3728085"/>
+            <wp:effectExtent l="0" t="0" r="0" b="5715"/>
+            <wp:docPr id="1395838380" name="Image 1"/>
             <wp:cNvGraphicFramePr>
               <a:graphicFrameLocks xmlns:a="http://schemas.openxmlformats.org/drawingml/2006/main" noChangeAspect="1"/>
             </wp:cNvGraphicFramePr>
@@ -911,7 +275,7 @@
               <a:graphicData uri="http://schemas.openxmlformats.org/drawingml/2006/picture">
                 <pic:pic xmlns:pic="http://schemas.openxmlformats.org/drawingml/2006/picture">
                   <pic:nvPicPr>
-                    <pic:cNvPr id="796462219" name=""/>
+                    <pic:cNvPr id="1395838380" name=""/>
                     <pic:cNvPicPr/>
                   </pic:nvPicPr>
                   <pic:blipFill>
@@ -923,7 +287,7 @@
                   <pic:spPr>
                     <a:xfrm>
                       <a:off x="0" y="0"/>
-                      <a:ext cx="5760720" cy="4942840"/>
+                      <a:ext cx="5760720" cy="3728085"/>
                     </a:xfrm>
                     <a:prstGeom prst="rect">
                       <a:avLst/>
@@ -945,18 +309,34 @@
           <w:szCs w:val="40"/>
         </w:rPr>
       </w:pPr>
-      <w:r>
+    </w:p>
+    <w:p>
+      <w:pPr>
         <w:rPr>
           <w:b/>
           <w:bCs/>
           <w:sz w:val="40"/>
           <w:szCs w:val="40"/>
         </w:rPr>
+      </w:pPr>
+    </w:p>
+    <w:p>
+      <w:pPr>
+        <w:rPr>
+          <w:sz w:val="40"/>
+          <w:szCs w:val="40"/>
+        </w:rPr>
+      </w:pPr>
+      <w:r>
+        <w:rPr>
+          <w:sz w:val="40"/>
+          <w:szCs w:val="40"/>
+        </w:rPr>
         <w:drawing>
-          <wp:inline distT="0" distB="0" distL="0" distR="0" wp14:anchorId="0E010AAF" wp14:editId="48D0BAA1">
-            <wp:extent cx="5760720" cy="1958340"/>
-            <wp:effectExtent l="0" t="0" r="0" b="3810"/>
-            <wp:docPr id="697598922" name="Image 1"/>
+          <wp:inline distT="0" distB="0" distL="0" distR="0" wp14:anchorId="52DA6F9D" wp14:editId="2404EAA9">
+            <wp:extent cx="5760720" cy="4352290"/>
+            <wp:effectExtent l="0" t="0" r="0" b="0"/>
+            <wp:docPr id="354122708" name="Image 1"/>
             <wp:cNvGraphicFramePr>
               <a:graphicFrameLocks xmlns:a="http://schemas.openxmlformats.org/drawingml/2006/main" noChangeAspect="1"/>
             </wp:cNvGraphicFramePr>
@@ -964,7 +344,7 @@
               <a:graphicData uri="http://schemas.openxmlformats.org/drawingml/2006/picture">
                 <pic:pic xmlns:pic="http://schemas.openxmlformats.org/drawingml/2006/picture">
                   <pic:nvPicPr>
-                    <pic:cNvPr id="697598922" name=""/>
+                    <pic:cNvPr id="354122708" name=""/>
                     <pic:cNvPicPr/>
                   </pic:nvPicPr>
                   <pic:blipFill>
@@ -976,7 +356,7 @@
                   <pic:spPr>
                     <a:xfrm>
                       <a:off x="0" y="0"/>
-                      <a:ext cx="5760720" cy="1958340"/>
+                      <a:ext cx="5760720" cy="4352290"/>
                     </a:xfrm>
                     <a:prstGeom prst="rect">
                       <a:avLst/>

</xml_diff>